<commit_message>
Oral health dashboard from HDC Data Exchange
</commit_message>
<xml_diff>
--- a/docs/เอกสารอธิบายเงื่อนไขการคำนวณ.docx
+++ b/docs/เอกสารอธิบายเงื่อนไขการคำนวณ.docx
@@ -50,7 +50,7 @@
           <w:sz w:val="30"/>
           <w:szCs w:val="30"/>
         </w:rPr>
-        <w:t>ข้อมูล​จาก HDC Data Exchange · ปีงบประมาณ 2569 · จัดทำ​เมื่อ 2026​-​08​-​11 14:24</w:t>
+        <w:t>ข้อมูล​จาก HDC Data Exchange · ปีงบประมาณ 2569 · จัดทำ​เมื่อ 2026​-​08​-​16 22:00</w:t>
       </w:r>
     </w:p>
     <w:p>
@@ -115,6 +115,268 @@
           <w:sz w:val="24"/>
         </w:rPr>
         <w:t>data/3ปี/  data/6ปี/  data/12ปี/  data/60ปี/</w:t>
+      </w:r>
+    </w:p>
+    <w:p>
+      <w:pPr>
+        <w:spacing w:after="60" w:before="120"/>
+      </w:pPr>
+      <w:r>
+        <w:rPr>
+          <w:rFonts w:ascii="TH Sarabun New" w:hAnsi="TH Sarabun New" w:cs="TH Sarabun New" w:eastAsia="TH Sarabun New"/>
+          <w:b/>
+          <w:i w:val="0"/>
+          <w:sz w:val="32"/>
+          <w:szCs w:val="32"/>
+          <w:bCs/>
+        </w:rPr>
+        <w:t>รายงาน​ที่​ต้อง​ส่ง​ออกจาก​ระบบ HDC</w:t>
+      </w:r>
+    </w:p>
+    <w:tbl>
+      <w:tblPr>
+        <w:tblStyle w:val="TableGrid"/>
+        <w:tblW w:type="auto" w:w="0"/>
+        <w:jc w:val="center"/>
+        <w:tblLayout w:type="fixed"/>
+        <w:tblLook w:firstColumn="1" w:firstRow="1" w:lastColumn="0" w:lastRow="0" w:noHBand="0" w:noVBand="1" w:val="04A0"/>
+      </w:tblPr>
+      <w:tblGrid>
+        <w:gridCol w:w="4677"/>
+        <w:gridCol w:w="4677"/>
+      </w:tblGrid>
+      <w:tr>
+        <w:tc>
+          <w:tcPr>
+            <w:tcW w:type="dxa" w:w="1928"/>
+            <w:shd w:val="clear" w:fill="E8F3F1"/>
+          </w:tcPr>
+          <w:p>
+            <w:pPr>
+              <w:spacing w:after="20" w:before="20"/>
+              <w:jc w:val="center"/>
+            </w:pPr>
+            <w:r>
+              <w:rPr>
+                <w:rFonts w:ascii="TH Sarabun New" w:hAnsi="TH Sarabun New" w:cs="TH Sarabun New" w:eastAsia="TH Sarabun New"/>
+                <w:b/>
+                <w:i w:val="0"/>
+                <w:sz w:val="26"/>
+                <w:szCs w:val="26"/>
+                <w:bCs/>
+              </w:rPr>
+              <w:t>โฟลเดอร์</w:t>
+            </w:r>
+          </w:p>
+        </w:tc>
+        <w:tc>
+          <w:tcPr>
+            <w:tcW w:type="dxa" w:w="7427"/>
+            <w:shd w:val="clear" w:fill="E8F3F1"/>
+          </w:tcPr>
+          <w:p>
+            <w:pPr>
+              <w:spacing w:after="20" w:before="20"/>
+              <w:jc w:val="center"/>
+            </w:pPr>
+            <w:r>
+              <w:rPr>
+                <w:rFonts w:ascii="TH Sarabun New" w:hAnsi="TH Sarabun New" w:cs="TH Sarabun New" w:eastAsia="TH Sarabun New"/>
+                <w:b/>
+                <w:i w:val="0"/>
+                <w:sz w:val="26"/>
+                <w:szCs w:val="26"/>
+                <w:bCs/>
+              </w:rPr>
+              <w:t>ชื่อ​รายงาน​ใน HDC</w:t>
+            </w:r>
+          </w:p>
+        </w:tc>
+      </w:tr>
+      <w:tr>
+        <w:tc>
+          <w:tcPr>
+            <w:tcW w:type="dxa" w:w="1928"/>
+          </w:tcPr>
+          <w:p>
+            <w:pPr>
+              <w:spacing w:after="20" w:before="20"/>
+              <w:jc w:val="left"/>
+            </w:pPr>
+            <w:r>
+              <w:rPr>
+                <w:rFonts w:ascii="Consolas" w:hAnsi="Consolas" w:cs="Consolas"/>
+                <w:rFonts w:ascii="Consolas" w:hAnsi="Consolas"/>
+                <w:sz w:val="23"/>
+              </w:rPr>
+              <w:t>data/3ปี/</w:t>
+            </w:r>
+          </w:p>
+        </w:tc>
+        <w:tc>
+          <w:tcPr>
+            <w:tcW w:type="dxa" w:w="7427"/>
+          </w:tcPr>
+          <w:p>
+            <w:pPr>
+              <w:spacing w:after="20" w:before="20"/>
+              <w:jc w:val="left"/>
+            </w:pPr>
+            <w:r>
+              <w:rPr>
+                <w:rFonts w:ascii="TH Sarabun New" w:hAnsi="TH Sarabun New" w:cs="TH Sarabun New" w:eastAsia="TH Sarabun New"/>
+                <w:b w:val="0"/>
+                <w:i w:val="0"/>
+                <w:sz w:val="26"/>
+                <w:szCs w:val="26"/>
+              </w:rPr>
+              <w:t>18.2 OHSP ร้อยละ​เด็ก​กลุ่มอายุ 3 ปี​มี​ฟันผุ​ใน​ฟันน้ำนม</w:t>
+            </w:r>
+          </w:p>
+        </w:tc>
+      </w:tr>
+      <w:tr>
+        <w:tc>
+          <w:tcPr>
+            <w:tcW w:type="dxa" w:w="1928"/>
+          </w:tcPr>
+          <w:p>
+            <w:pPr>
+              <w:spacing w:after="20" w:before="20"/>
+              <w:jc w:val="left"/>
+            </w:pPr>
+            <w:r>
+              <w:rPr>
+                <w:rFonts w:ascii="Consolas" w:hAnsi="Consolas" w:cs="Consolas"/>
+                <w:rFonts w:ascii="Consolas" w:hAnsi="Consolas"/>
+                <w:sz w:val="23"/>
+              </w:rPr>
+              <w:t>data/6ปี/</w:t>
+            </w:r>
+          </w:p>
+        </w:tc>
+        <w:tc>
+          <w:tcPr>
+            <w:tcW w:type="dxa" w:w="7427"/>
+          </w:tcPr>
+          <w:p>
+            <w:pPr>
+              <w:spacing w:after="20" w:before="20"/>
+              <w:jc w:val="left"/>
+            </w:pPr>
+            <w:r>
+              <w:rPr>
+                <w:rFonts w:ascii="TH Sarabun New" w:hAnsi="TH Sarabun New" w:cs="TH Sarabun New" w:eastAsia="TH Sarabun New"/>
+                <w:b w:val="0"/>
+                <w:i w:val="0"/>
+                <w:sz w:val="26"/>
+                <w:szCs w:val="26"/>
+              </w:rPr>
+              <w:t>18.3 OHSP ร้อยละ​เด็ก​กลุ่มอายุ 6 ปี​มี​ฟันผุ​ใน​ฟันแท้</w:t>
+            </w:r>
+          </w:p>
+        </w:tc>
+      </w:tr>
+      <w:tr>
+        <w:tc>
+          <w:tcPr>
+            <w:tcW w:type="dxa" w:w="1928"/>
+          </w:tcPr>
+          <w:p>
+            <w:pPr>
+              <w:spacing w:after="20" w:before="20"/>
+              <w:jc w:val="left"/>
+            </w:pPr>
+            <w:r>
+              <w:rPr>
+                <w:rFonts w:ascii="Consolas" w:hAnsi="Consolas" w:cs="Consolas"/>
+                <w:rFonts w:ascii="Consolas" w:hAnsi="Consolas"/>
+                <w:sz w:val="23"/>
+              </w:rPr>
+              <w:t>data/12ปี/</w:t>
+            </w:r>
+          </w:p>
+        </w:tc>
+        <w:tc>
+          <w:tcPr>
+            <w:tcW w:type="dxa" w:w="7427"/>
+          </w:tcPr>
+          <w:p>
+            <w:pPr>
+              <w:spacing w:after="20" w:before="20"/>
+              <w:jc w:val="left"/>
+            </w:pPr>
+            <w:r>
+              <w:rPr>
+                <w:rFonts w:ascii="TH Sarabun New" w:hAnsi="TH Sarabun New" w:cs="TH Sarabun New" w:eastAsia="TH Sarabun New"/>
+                <w:b w:val="0"/>
+                <w:i w:val="0"/>
+                <w:sz w:val="26"/>
+                <w:szCs w:val="26"/>
+              </w:rPr>
+              <w:t>18.5 OHSP ร้อยละ​เด็ก​กลุ่มอายุ 12 ปี​มี​ฟันผุ​ใน​ฟันแท้</w:t>
+            </w:r>
+          </w:p>
+        </w:tc>
+      </w:tr>
+      <w:tr>
+        <w:tc>
+          <w:tcPr>
+            <w:tcW w:type="dxa" w:w="1928"/>
+          </w:tcPr>
+          <w:p>
+            <w:pPr>
+              <w:spacing w:after="20" w:before="20"/>
+              <w:jc w:val="left"/>
+            </w:pPr>
+            <w:r>
+              <w:rPr>
+                <w:rFonts w:ascii="Consolas" w:hAnsi="Consolas" w:cs="Consolas"/>
+                <w:rFonts w:ascii="Consolas" w:hAnsi="Consolas"/>
+                <w:sz w:val="23"/>
+              </w:rPr>
+              <w:t>data/60ปี/</w:t>
+            </w:r>
+          </w:p>
+        </w:tc>
+        <w:tc>
+          <w:tcPr>
+            <w:tcW w:type="dxa" w:w="7427"/>
+          </w:tcPr>
+          <w:p>
+            <w:pPr>
+              <w:spacing w:after="20" w:before="20"/>
+              <w:jc w:val="left"/>
+            </w:pPr>
+            <w:r>
+              <w:rPr>
+                <w:rFonts w:ascii="TH Sarabun New" w:hAnsi="TH Sarabun New" w:cs="TH Sarabun New" w:eastAsia="TH Sarabun New"/>
+                <w:b w:val="0"/>
+                <w:i w:val="0"/>
+                <w:sz w:val="26"/>
+                <w:szCs w:val="26"/>
+              </w:rPr>
+              <w:t>18.8 OHSP ร้อยละ​ของ​กลุ่ม​ก่อน​วัยสูงอายุ ที่​มี​ฟันแท้​ใช้งาน​ได้​ไม่​น้อยกว่า 20 ซี่</w:t>
+            </w:r>
+          </w:p>
+        </w:tc>
+      </w:tr>
+    </w:tbl>
+    <w:p>
+      <w:pPr>
+        <w:spacing w:after="120" w:before="60"/>
+        <w:jc w:val="both"/>
+      </w:pPr>
+      <w:r>
+        <w:rPr>
+          <w:rFonts w:ascii="TH Sarabun New" w:hAnsi="TH Sarabun New" w:cs="TH Sarabun New" w:eastAsia="TH Sarabun New"/>
+          <w:b w:val="0"/>
+          <w:i w:val="0"/>
+          <w:color w:val="475569"/>
+          <w:sz w:val="28"/>
+          <w:szCs w:val="28"/>
+        </w:rPr>
+        <w:t>ทุก​รายการ​ต้อง​ส่งออก​ด้วย​ปุ่ม Data Exchange ซึ่ง​ให้​ข้อมูล​รายบุคคล​พร้อม​คอลัมน์​ผล​ตรวจ​ฟัน ไม่​ใช่​ปุ่ม​ส่งออก​ตาราง​สรุป</w:t>
       </w:r>
     </w:p>
     <w:p>
@@ -5341,7 +5603,7 @@
           <w:sz w:val="28"/>
           <w:szCs w:val="28"/>
         </w:rPr>
-        <w:t>เอกสาร​ฉบับ​นี้​อ้างอิง​ผล​การประมวลผลข้อมูล​ปีงบประมาณ 2569 จำนวน 241,439 รายการ จาก 188 หน่วย​บริการ จัดทำ​เมื่อ 2026​-​08​-​11 14:24</w:t>
+        <w:t>เอกสาร​ฉบับ​นี้​อ้างอิง​ผล​การประมวลผลข้อมูล​ปีงบประมาณ 2569 จำนวน 241,439 รายการ จาก 188 หน่วย​บริการ จัดทำ​เมื่อ 2026​-​08​-​16 22:00</w:t>
       </w:r>
     </w:p>
     <w:sectPr>

</xml_diff>